<commit_message>
logo updated with Block
</commit_message>
<xml_diff>
--- a/docs/guild_charter.docx
+++ b/docs/guild_charter.docx
@@ -5,114 +5,172 @@
     <w:p>
       <w:pPr>
         <w:pStyle w:val="Title"/>
+        <w:spacing w:before="0" w:after="0"/>
       </w:pPr>
       <w:bookmarkStart w:id="0" w:name="melbourne-tech-guilds---guild-charter"/>
       <w:r>
-        <w:t>Melbourne Tech Guilds - Guild Charter</w:t>
+        <w:drawing>
+          <wp:anchor distT="0" distB="0" distL="114300" distR="114300" simplePos="0" relativeHeight="251658240" behindDoc="0" locked="0" layoutInCell="1" allowOverlap="1" wp14:anchorId="2B84E8A0" wp14:editId="78A0DBC9">
+            <wp:simplePos x="0" y="0"/>
+            <wp:positionH relativeFrom="column">
+              <wp:posOffset>539750</wp:posOffset>
+            </wp:positionH>
+            <wp:positionV relativeFrom="paragraph">
+              <wp:posOffset>-535825</wp:posOffset>
+            </wp:positionV>
+            <wp:extent cx="5785200" cy="1220400"/>
+            <wp:effectExtent l="0" t="0" r="0" b="0"/>
+            <wp:wrapTopAndBottom/>
+            <wp:docPr id="2135594042" name="Picture 2"/>
+            <wp:cNvGraphicFramePr>
+              <a:graphicFrameLocks xmlns:a="http://schemas.openxmlformats.org/drawingml/2006/main" noChangeAspect="1"/>
+            </wp:cNvGraphicFramePr>
+            <a:graphic xmlns:a="http://schemas.openxmlformats.org/drawingml/2006/main">
+              <a:graphicData uri="http://schemas.openxmlformats.org/drawingml/2006/picture">
+                <pic:pic xmlns:pic="http://schemas.openxmlformats.org/drawingml/2006/picture">
+                  <pic:nvPicPr>
+                    <pic:cNvPr id="2135594042" name="Picture 2135594042"/>
+                    <pic:cNvPicPr/>
+                  </pic:nvPicPr>
+                  <pic:blipFill>
+                    <a:blip r:embed="rId8" cstate="print">
+                      <a:extLst>
+                        <a:ext uri="{28A0092B-C50C-407E-A947-70E740481C1C}">
+                          <a14:useLocalDpi xmlns:a14="http://schemas.microsoft.com/office/drawing/2010/main" val="0"/>
+                        </a:ext>
+                      </a:extLst>
+                    </a:blip>
+                    <a:stretch>
+                      <a:fillRect/>
+                    </a:stretch>
+                  </pic:blipFill>
+                  <pic:spPr>
+                    <a:xfrm>
+                      <a:off x="0" y="0"/>
+                      <a:ext cx="5785200" cy="1220400"/>
+                    </a:xfrm>
+                    <a:prstGeom prst="rect">
+                      <a:avLst/>
+                    </a:prstGeom>
+                  </pic:spPr>
+                </pic:pic>
+              </a:graphicData>
+            </a:graphic>
+            <wp14:sizeRelH relativeFrom="margin">
+              <wp14:pctWidth>0</wp14:pctWidth>
+            </wp14:sizeRelH>
+            <wp14:sizeRelV relativeFrom="margin">
+              <wp14:pctHeight>0</wp14:pctHeight>
+            </wp14:sizeRelV>
+          </wp:anchor>
+        </w:drawing>
+      </w:r>
+    </w:p>
+    <w:p>
+      <w:pPr>
+        <w:pStyle w:val="Title"/>
+        <w:spacing w:before="0" w:after="0"/>
+      </w:pPr>
+      <w:r>
+        <w:t>Guild Charter</w:t>
       </w:r>
     </w:p>
     <w:p>
       <w:pPr>
         <w:pStyle w:val="Heading2"/>
       </w:pPr>
-      <w:bookmarkStart w:id="1" w:name="our-purpose"/>
-      <w:bookmarkStart w:id="2" w:name="_Toc219962791"/>
+      <w:bookmarkStart w:id="1" w:name="_Toc219962791"/>
+      <w:bookmarkStart w:id="2" w:name="our-purpose"/>
       <w:r>
         <w:t>Our Purpose</w:t>
       </w:r>
+      <w:bookmarkEnd w:id="1"/>
+    </w:p>
+    <w:p>
+      <w:pPr>
+        <w:pStyle w:val="FirstParagraph"/>
+      </w:pPr>
+      <w:r>
+        <w:t>We are a community of makers, engineers, and technicians who share knowledge, solve problems collaboratively, and foster creativity across multiple technologies. Each guild operates as a focused community within our larger ecosystem, united by common values and practices.</w:t>
+      </w:r>
+    </w:p>
+    <w:p>
+      <w:pPr>
+        <w:pStyle w:val="Heading2"/>
+      </w:pPr>
+      <w:bookmarkStart w:id="3" w:name="_Toc219962792"/>
+      <w:bookmarkStart w:id="4" w:name="core-principles"/>
       <w:bookmarkEnd w:id="2"/>
-    </w:p>
-    <w:p>
-      <w:pPr>
-        <w:pStyle w:val="FirstParagraph"/>
-      </w:pPr>
-      <w:r>
-        <w:t>We are a community of makers, engineers, and technicians who share knowledge, solve problems collaboratively, and foster creativity across multiple technologies. Each guild operates as a focused community within our larger ecosystem, united by common values and practices.</w:t>
-      </w:r>
-    </w:p>
-    <w:p>
-      <w:pPr>
-        <w:pStyle w:val="Heading2"/>
-      </w:pPr>
-      <w:bookmarkStart w:id="3" w:name="core-principles"/>
-      <w:bookmarkStart w:id="4" w:name="_Toc219962792"/>
-      <w:bookmarkEnd w:id="1"/>
       <w:r>
         <w:t>Core Principles</w:t>
       </w:r>
-      <w:bookmarkEnd w:id="4"/>
+      <w:bookmarkEnd w:id="3"/>
     </w:p>
     <w:p>
       <w:pPr>
         <w:pStyle w:val="Heading3"/>
       </w:pPr>
-      <w:bookmarkStart w:id="5" w:name="knowledge-sharing"/>
-      <w:bookmarkStart w:id="6" w:name="_Toc219962793"/>
-      <w:r>
-        <w:t>Knowledge</w:t>
-      </w:r>
-      <w:r>
-        <w:t xml:space="preserve"> Sharing</w:t>
-      </w:r>
+      <w:bookmarkStart w:id="5" w:name="_Toc219962793"/>
+      <w:bookmarkStart w:id="6" w:name="knowledge-sharing"/>
+      <w:r>
+        <w:t>Knowledge Sharing</w:t>
+      </w:r>
+      <w:bookmarkEnd w:id="5"/>
+    </w:p>
+    <w:p>
+      <w:pPr>
+        <w:pStyle w:val="Compact"/>
+        <w:numPr>
+          <w:ilvl w:val="0"/>
+          <w:numId w:val="2"/>
+        </w:numPr>
+      </w:pPr>
+      <w:r>
+        <w:t>We freely share our expertise with fellow makers</w:t>
+      </w:r>
+    </w:p>
+    <w:p>
+      <w:pPr>
+        <w:pStyle w:val="Compact"/>
+        <w:numPr>
+          <w:ilvl w:val="0"/>
+          <w:numId w:val="2"/>
+        </w:numPr>
+      </w:pPr>
+      <w:r>
+        <w:t>We mentor, guide and encourage the completion of projects rather than just act like a helpdesk</w:t>
+      </w:r>
+    </w:p>
+    <w:p>
+      <w:pPr>
+        <w:pStyle w:val="Compact"/>
+        <w:numPr>
+          <w:ilvl w:val="0"/>
+          <w:numId w:val="2"/>
+        </w:numPr>
+      </w:pPr>
+      <w:r>
+        <w:t>We offer multiple solution options to empower informed decision-making</w:t>
+      </w:r>
+    </w:p>
+    <w:p>
+      <w:pPr>
+        <w:pStyle w:val="Compact"/>
+        <w:numPr>
+          <w:ilvl w:val="0"/>
+          <w:numId w:val="2"/>
+        </w:numPr>
+      </w:pPr>
+      <w:r>
+        <w:t>We learn from each other’s successes and failures</w:t>
+      </w:r>
+    </w:p>
+    <w:p>
+      <w:pPr>
+        <w:pStyle w:val="Heading3"/>
+      </w:pPr>
+      <w:bookmarkStart w:id="7" w:name="_Toc219962794"/>
       <w:bookmarkEnd w:id="6"/>
-    </w:p>
-    <w:p>
-      <w:pPr>
-        <w:pStyle w:val="Compact"/>
-        <w:numPr>
-          <w:ilvl w:val="0"/>
-          <w:numId w:val="2"/>
-        </w:numPr>
-      </w:pPr>
-      <w:r>
-        <w:t>W</w:t>
-      </w:r>
-      <w:r>
-        <w:t>e freely share our expertise with fellow makers</w:t>
-      </w:r>
-    </w:p>
-    <w:p>
-      <w:pPr>
-        <w:pStyle w:val="Compact"/>
-        <w:numPr>
-          <w:ilvl w:val="0"/>
-          <w:numId w:val="2"/>
-        </w:numPr>
-      </w:pPr>
-      <w:r>
-        <w:t>We mentor, guide and encourage the completion of projects rather than just act like a helpdesk</w:t>
-      </w:r>
-    </w:p>
-    <w:p>
-      <w:pPr>
-        <w:pStyle w:val="Compact"/>
-        <w:numPr>
-          <w:ilvl w:val="0"/>
-          <w:numId w:val="2"/>
-        </w:numPr>
-      </w:pPr>
-      <w:r>
-        <w:t>We offer multiple solution options to empower informed decision-making</w:t>
-      </w:r>
-    </w:p>
-    <w:p>
-      <w:pPr>
-        <w:pStyle w:val="Compact"/>
-        <w:numPr>
-          <w:ilvl w:val="0"/>
-          <w:numId w:val="2"/>
-        </w:numPr>
-      </w:pPr>
-      <w:r>
-        <w:t>We learn from each other’s successes and failures</w:t>
-      </w:r>
-    </w:p>
-    <w:p>
-      <w:pPr>
-        <w:pStyle w:val="Heading3"/>
-      </w:pPr>
-      <w:bookmarkStart w:id="7" w:name="_Toc219962794"/>
-      <w:bookmarkEnd w:id="5"/>
       <w:r>
         <w:t>Collaborative Spirit</w:t>
       </w:r>
@@ -128,10 +186,7 @@
       </w:pPr>
       <w:bookmarkStart w:id="8" w:name="collaborative-spirit"/>
       <w:r>
-        <w:t>W</w:t>
-      </w:r>
-      <w:r>
-        <w:t>e work together on complex, multi-technology projects</w:t>
+        <w:t>We work together on complex, multi-technology projects</w:t>
       </w:r>
     </w:p>
     <w:p>
@@ -191,10 +246,7 @@
       </w:pPr>
       <w:bookmarkStart w:id="10" w:name="community-first"/>
       <w:r>
-        <w:t>W</w:t>
-      </w:r>
-      <w:r>
-        <w:t>e are non-commercial in nature</w:t>
+        <w:t>We are non-commercial in nature</w:t>
       </w:r>
     </w:p>
     <w:p>
@@ -238,7 +290,7 @@
         <w:pStyle w:val="Heading2"/>
       </w:pPr>
       <w:bookmarkStart w:id="11" w:name="_Toc219962796"/>
-      <w:bookmarkEnd w:id="3"/>
+      <w:bookmarkEnd w:id="4"/>
       <w:bookmarkEnd w:id="10"/>
       <w:r>
         <w:t>Guild Operations</w:t>
@@ -265,10 +317,7 @@
       </w:pPr>
       <w:bookmarkStart w:id="13" w:name="membership-access"/>
       <w:r>
-        <w:t>E</w:t>
-      </w:r>
-      <w:r>
-        <w:t>ach guild manages its own membership and access</w:t>
+        <w:t>Each guild manages its own membership and access</w:t>
       </w:r>
     </w:p>
     <w:p>
@@ -341,10 +390,7 @@
       <w:bookmarkStart w:id="15" w:name="guild-operations"/>
       <w:bookmarkStart w:id="16" w:name="decision-making"/>
       <w:r>
-        <w:t>G</w:t>
-      </w:r>
-      <w:r>
-        <w:t>uilds operate autonomously within this charter’s framework</w:t>
+        <w:t>Guilds operate autonomously within this charter’s framework</w:t>
       </w:r>
     </w:p>
     <w:p>
@@ -396,6 +442,7 @@
       <w:bookmarkEnd w:id="15"/>
       <w:bookmarkEnd w:id="16"/>
       <w:r>
+        <w:lastRenderedPageBreak/>
         <w:t>Safety &amp; Conduct</w:t>
       </w:r>
       <w:bookmarkEnd w:id="17"/>
@@ -420,10 +467,7 @@
       </w:pPr>
       <w:bookmarkStart w:id="19" w:name="physical-safety"/>
       <w:r>
-        <w:t>M</w:t>
-      </w:r>
-      <w:r>
-        <w:t>embers working with tools, machinery, or electronics must follow appropriate safety protocols</w:t>
+        <w:t>Members working with tools, machinery, or electronics must follow appropriate safety protocols</w:t>
       </w:r>
     </w:p>
     <w:p>
@@ -483,10 +527,7 @@
       </w:pPr>
       <w:bookmarkStart w:id="21" w:name="digital-safety-security"/>
       <w:r>
-        <w:t>M</w:t>
-      </w:r>
-      <w:r>
-        <w:t>embers protect their own and others’ credentials and access</w:t>
+        <w:t>Members protect their own and others’ credentials and access</w:t>
       </w:r>
     </w:p>
     <w:p>
@@ -546,10 +587,7 @@
       </w:pPr>
       <w:bookmarkStart w:id="23" w:name="privacy"/>
       <w:r>
-        <w:t>P</w:t>
-      </w:r>
-      <w:r>
-        <w:t>ersonal information shared within the community remains confidential</w:t>
+        <w:t>Personal information shared within the community remains confidential</w:t>
       </w:r>
     </w:p>
     <w:p>
@@ -609,10 +647,7 @@
       </w:pPr>
       <w:bookmarkStart w:id="25" w:name="inclusive-environment"/>
       <w:r>
-        <w:t>W</w:t>
-      </w:r>
-      <w:r>
-        <w:t>e welcome makers of all backgrounds, experience levels, and identities</w:t>
+        <w:t>We welcome makers of all backgrounds, experience levels, and identities</w:t>
       </w:r>
     </w:p>
     <w:p>
@@ -624,7 +659,15 @@
         </w:numPr>
       </w:pPr>
       <w:r>
-        <w:t>Discrimination, harassment, or exclusionary behavior is not tolerated</w:t>
+        <w:t xml:space="preserve">Discrimination, harassment, or exclusionary </w:t>
+      </w:r>
+      <w:proofErr w:type="spellStart"/>
+      <w:r>
+        <w:t>behavior</w:t>
+      </w:r>
+      <w:proofErr w:type="spellEnd"/>
+      <w:r>
+        <w:t xml:space="preserve"> is not tolerated</w:t>
       </w:r>
     </w:p>
     <w:p>
@@ -685,10 +728,7 @@
       <w:bookmarkStart w:id="27" w:name="safety-conduct"/>
       <w:bookmarkStart w:id="28" w:name="communication-standards"/>
       <w:r>
-        <w:t>W</w:t>
-      </w:r>
-      <w:r>
-        <w:t>e engage in good faith and assume good intentions</w:t>
+        <w:t>We engage in good faith and assume good intentions</w:t>
       </w:r>
     </w:p>
     <w:p>
@@ -712,7 +752,15 @@
         </w:numPr>
       </w:pPr>
       <w:r>
-        <w:t>Personal attacks, trolling, and inflammatory behavior are unacceptable</w:t>
+        <w:t xml:space="preserve">Personal attacks, trolling, and inflammatory </w:t>
+      </w:r>
+      <w:proofErr w:type="spellStart"/>
+      <w:r>
+        <w:t>behavior</w:t>
+      </w:r>
+      <w:proofErr w:type="spellEnd"/>
+      <w:r>
+        <w:t xml:space="preserve"> are unacceptable</w:t>
       </w:r>
     </w:p>
     <w:p>
@@ -750,6 +798,7 @@
         <w:pStyle w:val="Heading2"/>
       </w:pPr>
       <w:r>
+        <w:lastRenderedPageBreak/>
         <w:t>Liability &amp; Legal</w:t>
       </w:r>
       <w:bookmarkEnd w:id="29"/>
@@ -774,10 +823,7 @@
       </w:pPr>
       <w:bookmarkStart w:id="31" w:name="personal-responsibility"/>
       <w:r>
-        <w:t>M</w:t>
-      </w:r>
-      <w:r>
-        <w:t>embers participate voluntarily at their own risk</w:t>
+        <w:t>Members participate voluntarily at their own risk</w:t>
       </w:r>
     </w:p>
     <w:p>
@@ -837,10 +883,7 @@
       </w:pPr>
       <w:bookmarkStart w:id="33" w:name="intellectual-property"/>
       <w:r>
-        <w:t>M</w:t>
-      </w:r>
-      <w:r>
-        <w:t>embers retain ownership of their own work and ideas</w:t>
+        <w:t>Members retain ownership of their own work and ideas</w:t>
       </w:r>
     </w:p>
     <w:p>
@@ -876,10 +919,7 @@
         </w:numPr>
       </w:pPr>
       <w:r>
-        <w:t>Open-source</w:t>
-      </w:r>
-      <w:r>
-        <w:t xml:space="preserve"> contributions follow the relevant license terms</w:t>
+        <w:t>Open-source contributions follow the relevant license terms</w:t>
       </w:r>
     </w:p>
     <w:p>
@@ -904,10 +944,7 @@
       <w:bookmarkStart w:id="35" w:name="liability-legal"/>
       <w:bookmarkStart w:id="36" w:name="commercial-activities"/>
       <w:r>
-        <w:t>D</w:t>
-      </w:r>
-      <w:r>
-        <w:t>irect commercial solicitation of members is not permitted</w:t>
+        <w:t>Direct commercial solicitation of members is not permitted</w:t>
       </w:r>
     </w:p>
     <w:p>
@@ -950,41 +987,102 @@
       <w:pPr>
         <w:pStyle w:val="Heading2"/>
       </w:pPr>
-      <w:bookmarkStart w:id="37" w:name="conflict-resolution"/>
-      <w:bookmarkStart w:id="38" w:name="_Toc219962809"/>
+      <w:bookmarkStart w:id="37" w:name="_Toc219962809"/>
+      <w:bookmarkStart w:id="38" w:name="conflict-resolution"/>
       <w:bookmarkEnd w:id="35"/>
       <w:bookmarkEnd w:id="36"/>
       <w:r>
         <w:t>Conflict Resolution</w:t>
       </w:r>
+      <w:bookmarkEnd w:id="37"/>
+    </w:p>
+    <w:p>
+      <w:pPr>
+        <w:pStyle w:val="FirstParagraph"/>
+      </w:pPr>
+      <w:r>
+        <w:t>When conflicts arise: 1. Address issues directly and respectfully with involved parties 2. Seek mediation from guild coordinators if direct resolution fails 3. Involve broader community leadership for serious or persistent issues 4. Serious violations of safety or conduct standards may result in removal</w:t>
+      </w:r>
+    </w:p>
+    <w:p>
+      <w:pPr>
+        <w:pStyle w:val="Heading2"/>
+      </w:pPr>
+      <w:bookmarkStart w:id="39" w:name="_Toc219962810"/>
+      <w:bookmarkStart w:id="40" w:name="guild-autonomy-boundaries"/>
       <w:bookmarkEnd w:id="38"/>
+      <w:r>
+        <w:t>Guild Autonomy &amp; Boundaries</w:t>
+      </w:r>
+      <w:bookmarkEnd w:id="39"/>
     </w:p>
     <w:p>
       <w:pPr>
         <w:pStyle w:val="FirstParagraph"/>
       </w:pPr>
       <w:r>
-        <w:t>When conflicts arise: 1. Address issues directly and respectfully with involved parties 2. Seek mediation from guild coordinators if direct resolution fails 3. Involve broader community leadership for serious or persistent issues 4. Serious violations of safety or conduct standards may result in removal</w:t>
+        <w:t>Each guild may: - Establish specific technical standards or practices - Create additional guidelines relevant to their domain - Organize events, workshops, or collaborative projects - Manage their own communication channels and tools</w:t>
+      </w:r>
+    </w:p>
+    <w:p>
+      <w:pPr>
+        <w:pStyle w:val="BodyText"/>
+      </w:pPr>
+      <w:r>
+        <w:t>All guild-specific rules must align with this charter’s principles.</w:t>
       </w:r>
     </w:p>
     <w:p>
       <w:pPr>
         <w:pStyle w:val="Heading2"/>
       </w:pPr>
-      <w:bookmarkStart w:id="39" w:name="guild-autonomy-boundaries"/>
-      <w:bookmarkStart w:id="40" w:name="_Toc219962810"/>
-      <w:bookmarkEnd w:id="37"/>
-      <w:r>
-        <w:t>Guild Autonomy &amp; Boundaries</w:t>
-      </w:r>
+      <w:bookmarkStart w:id="41" w:name="_Toc219962811"/>
+      <w:bookmarkStart w:id="42" w:name="evolution-of-this-charter"/>
       <w:bookmarkEnd w:id="40"/>
+      <w:r>
+        <w:t>Evolution of This Charter</w:t>
+      </w:r>
+      <w:bookmarkEnd w:id="41"/>
     </w:p>
     <w:p>
       <w:pPr>
         <w:pStyle w:val="FirstParagraph"/>
       </w:pPr>
       <w:r>
-        <w:t>Each guild may: - Establish specific technical standards or practices - Create additional guidelines relevant to their domain - Organize events, workshops, or collaborative projects - Manage their own communication channels and tools</w:t>
+        <w:t>This charter is a living document: - Amendments may be proposed by any member - Changes require discussion and broad community support - We adapt as our community grows and learns - The core principles of safety, respect, and knowledge-sharing remain constant</w:t>
+      </w:r>
+    </w:p>
+    <w:p>
+      <w:pPr>
+        <w:pStyle w:val="Heading2"/>
+      </w:pPr>
+      <w:bookmarkStart w:id="43" w:name="_Toc219962812"/>
+      <w:bookmarkStart w:id="44" w:name="acknowledgment"/>
+      <w:bookmarkEnd w:id="42"/>
+      <w:r>
+        <w:t>Acknowledgment</w:t>
+      </w:r>
+      <w:bookmarkEnd w:id="43"/>
+    </w:p>
+    <w:p>
+      <w:pPr>
+        <w:pStyle w:val="FirstParagraph"/>
+      </w:pPr>
+      <w:r>
+        <w:t>By participating in any guild within Melbourne Tech Guilds: - I agree to uphold this charter - I understand that I participate at my own risk - I commit to contributing positively to our community - I will respect the time, work, and dignity of fellow members</w:t>
+      </w:r>
+    </w:p>
+    <w:p>
+      <w:r>
+        <w:br w:type="page"/>
+      </w:r>
+    </w:p>
+    <w:p>
+      <w:pPr>
+        <w:pStyle w:val="Heading2"/>
+      </w:pPr>
+      <w:r>
+        <w:t>Photo and Video Release</w:t>
       </w:r>
     </w:p>
     <w:p>
@@ -992,56 +1090,122 @@
         <w:pStyle w:val="BodyText"/>
       </w:pPr>
       <w:r>
-        <w:t>All guild-specific rules must align with this charter’s principles.</w:t>
-      </w:r>
-    </w:p>
-    <w:p>
-      <w:pPr>
-        <w:pStyle w:val="Heading2"/>
-      </w:pPr>
-      <w:bookmarkStart w:id="41" w:name="evolution-of-this-charter"/>
-      <w:bookmarkStart w:id="42" w:name="_Toc219962811"/>
-      <w:bookmarkEnd w:id="39"/>
-      <w:r>
-        <w:t>Evolution of This Charter</w:t>
-      </w:r>
-      <w:bookmarkEnd w:id="42"/>
-    </w:p>
-    <w:p>
-      <w:pPr>
-        <w:pStyle w:val="FirstParagraph"/>
-      </w:pPr>
-      <w:r>
-        <w:t xml:space="preserve">This charter is a living document: </w:t>
-      </w:r>
-      <w:r>
-        <w:t>- Amendments may be proposed by any member - Changes require discussion and broad community support - We adapt as our community grows and learns - The core principles of safety, respect, and knowledge-sharing remain constant</w:t>
-      </w:r>
-    </w:p>
-    <w:p>
-      <w:pPr>
-        <w:pStyle w:val="Heading2"/>
-      </w:pPr>
-      <w:bookmarkStart w:id="43" w:name="acknowledgment"/>
-      <w:bookmarkStart w:id="44" w:name="_Toc219962812"/>
-      <w:bookmarkEnd w:id="41"/>
-      <w:r>
-        <w:t>Acknowledgment</w:t>
-      </w:r>
-      <w:bookmarkEnd w:id="44"/>
-    </w:p>
-    <w:p>
-      <w:pPr>
-        <w:pStyle w:val="FirstParagraph"/>
-      </w:pPr>
-      <w:r>
-        <w:t>By participating in any guild within Melbourne Tech Guilds: - I agree to uphold this charter - I understand that I participate at my own risk - I commit to contributing positively to our community - I will respect the time, work, and dignity of fellow members</w:t>
+        <w:t xml:space="preserve">Melbourne Tech Guilds are required to provide some photographs of sessions at the libraries for their marketing.  We will also use photos and videos taken in the sessions for online streaming, newsletters and general marketing.  If you wish to opt-in or opt-out of appearing in photos and videos please let us know at registration and we will </w:t>
+      </w:r>
+      <w:r>
+        <w:t>endeavour</w:t>
+      </w:r>
+      <w:r>
+        <w:t xml:space="preserve"> to avoid capturing you at the time.  If you do appear accidentally, let us know and we will ‘pull-down’ where possible.</w:t>
+      </w:r>
+    </w:p>
+    <w:p>
+      <w:pPr>
+        <w:pStyle w:val="BodyText"/>
+      </w:pPr>
+    </w:p>
+    <w:p>
+      <w:pPr>
+        <w:pStyle w:val="BodyText"/>
+      </w:pPr>
+      <w:r>
+        <w:t>If you do ‘opt-in’ than the conditions are as follows:</w:t>
+      </w:r>
+    </w:p>
+    <w:p>
+      <w:pPr>
+        <w:pStyle w:val="BodyText"/>
+        <w:numPr>
+          <w:ilvl w:val="0"/>
+          <w:numId w:val="17"/>
+        </w:numPr>
+      </w:pPr>
+      <w:r>
+        <w:t xml:space="preserve">I allow </w:t>
+      </w:r>
+      <w:r>
+        <w:t>Melbourne Tech Guilds</w:t>
+      </w:r>
+      <w:r>
+        <w:t xml:space="preserve"> to take or capture my photos and videos.</w:t>
+      </w:r>
+    </w:p>
+    <w:p>
+      <w:pPr>
+        <w:pStyle w:val="BodyText"/>
+        <w:numPr>
+          <w:ilvl w:val="0"/>
+          <w:numId w:val="17"/>
+        </w:numPr>
+      </w:pPr>
+      <w:r>
+        <w:t>I understand that all photos and videos that will be taken in this activity are copyrighted by Melbourne Tech Guilds</w:t>
+      </w:r>
+      <w:r>
+        <w:t>.</w:t>
+      </w:r>
+    </w:p>
+    <w:p>
+      <w:pPr>
+        <w:pStyle w:val="BodyText"/>
+        <w:numPr>
+          <w:ilvl w:val="0"/>
+          <w:numId w:val="17"/>
+        </w:numPr>
+      </w:pPr>
+      <w:r>
+        <w:t>I understand that I will/ will not receive any monetary compensation.</w:t>
+      </w:r>
+    </w:p>
+    <w:p>
+      <w:pPr>
+        <w:pStyle w:val="BodyText"/>
+        <w:numPr>
+          <w:ilvl w:val="0"/>
+          <w:numId w:val="17"/>
+        </w:numPr>
+      </w:pPr>
+      <w:r>
+        <w:t>I authori</w:t>
+      </w:r>
+      <w:r>
+        <w:t>s</w:t>
+      </w:r>
+      <w:r>
+        <w:t>e Melbourne Tech Guilds</w:t>
+      </w:r>
+      <w:r>
+        <w:t xml:space="preserve"> </w:t>
+      </w:r>
+      <w:r>
+        <w:t>to distribute and reproduce the materials for the following purposes: Portfolio showcase, advertising, marketing, branding, educational, digital promotions, internet videos, online courses, media, other commercial or non-commercial purposes</w:t>
+      </w:r>
+      <w:r>
+        <w:t>.</w:t>
+      </w:r>
+    </w:p>
+    <w:p>
+      <w:pPr>
+        <w:pStyle w:val="BodyText"/>
+        <w:numPr>
+          <w:ilvl w:val="0"/>
+          <w:numId w:val="17"/>
+        </w:numPr>
+      </w:pPr>
+      <w:r>
+        <w:t xml:space="preserve">I grant Melbourne Tech Guilds to use my photos and videos on </w:t>
+      </w:r>
+      <w:r>
+        <w:t>YouTube</w:t>
+      </w:r>
+      <w:r>
+        <w:t>, Vimeo, Facebook, Twitter, Instagram, and other social media platform.</w:t>
       </w:r>
     </w:p>
     <w:p>
       <w:r>
         <w:pict w14:anchorId="28CB19ED">
-          <v:rect id="_x0000_i1033" style="width:0;height:1.5pt" o:hralign="center" o:hrstd="t" o:hr="t"/>
+          <v:rect id="_x0000_i1025" style="width:0;height:1.5pt" o:hralign="center" o:hrstd="t" o:hr="t"/>
         </w:pict>
       </w:r>
     </w:p>
@@ -1054,7 +1218,42 @@
           <w:i/>
           <w:iCs/>
         </w:rPr>
-        <w:t>Version 1.0 - December 2025</w:t>
+        <w:t xml:space="preserve">Version </w:t>
+      </w:r>
+      <w:r>
+        <w:rPr>
+          <w:i/>
+          <w:iCs/>
+        </w:rPr>
+        <w:t>2</w:t>
+      </w:r>
+      <w:r>
+        <w:rPr>
+          <w:i/>
+          <w:iCs/>
+        </w:rPr>
+        <w:t xml:space="preserve">.0 </w:t>
+      </w:r>
+      <w:r>
+        <w:rPr>
+          <w:i/>
+          <w:iCs/>
+        </w:rPr>
+        <w:t>–</w:t>
+      </w:r>
+      <w:r>
+        <w:rPr>
+          <w:i/>
+          <w:iCs/>
+        </w:rPr>
+        <w:t xml:space="preserve"> </w:t>
+      </w:r>
+      <w:r>
+        <w:rPr>
+          <w:i/>
+          <w:iCs/>
+        </w:rPr>
+        <w:t>January 2026</w:t>
       </w:r>
       <w:r>
         <w:t xml:space="preserve"> </w:t>
@@ -1067,11 +1266,12 @@
         <w:t>melbourne.techguilds.au</w:t>
       </w:r>
       <w:bookmarkEnd w:id="0"/>
-      <w:bookmarkEnd w:id="43"/>
+      <w:bookmarkEnd w:id="44"/>
     </w:p>
     <w:sectPr>
+      <w:headerReference w:type="default" r:id="rId9"/>
       <w:pgSz w:w="12240" w:h="15840"/>
-      <w:pgMar w:top="720" w:right="720" w:bottom="720" w:left="720" w:header="720" w:footer="720" w:gutter="0"/>
+      <w:pgMar w:top="0" w:right="720" w:bottom="720" w:left="720" w:header="720" w:footer="720" w:gutter="0"/>
       <w:cols w:space="720"/>
       <w:docGrid w:linePitch="326"/>
     </w:sectPr>
@@ -1121,6 +1321,16 @@
     </w:p>
   </w:footnote>
 </w:footnotes>
+</file>
+
+<file path=word/header1.xml><?xml version="1.0" encoding="utf-8"?>
+<w:hdr xmlns:wpc="http://schemas.microsoft.com/office/word/2010/wordprocessingCanvas" xmlns:cx="http://schemas.microsoft.com/office/drawing/2014/chartex" xmlns:cx1="http://schemas.microsoft.com/office/drawing/2015/9/8/chartex" xmlns:cx2="http://schemas.microsoft.com/office/drawing/2015/10/21/chartex" xmlns:cx3="http://schemas.microsoft.com/office/drawing/2016/5/9/chartex" xmlns:cx4="http://schemas.microsoft.com/office/drawing/2016/5/10/chartex" xmlns:cx5="http://schemas.microsoft.com/office/drawing/2016/5/11/chartex" xmlns:cx6="http://schemas.microsoft.com/office/drawing/2016/5/12/chartex" xmlns:cx7="http://schemas.microsoft.com/office/drawing/2016/5/13/chartex" xmlns:cx8="http://schemas.microsoft.com/office/drawing/2016/5/14/chartex" xmlns:mc="http://schemas.openxmlformats.org/markup-compatibility/2006" xmlns:aink="http://schemas.microsoft.com/office/drawing/2016/ink" xmlns:am3d="http://schemas.microsoft.com/office/drawing/2017/model3d" xmlns:o="urn:schemas-microsoft-com:office:office" xmlns:oel="http://schemas.microsoft.com/office/2019/extlst" xmlns:r="http://schemas.openxmlformats.org/officeDocument/2006/relationships" xmlns:m="http://schemas.openxmlformats.org/officeDocument/2006/math" xmlns:v="urn:schemas-microsoft-com:vml" xmlns:wp14="http://schemas.microsoft.com/office/word/2010/wordprocessingDrawing" xmlns:wp="http://schemas.openxmlformats.org/drawingml/2006/wordprocessingDrawing" xmlns:w10="urn:schemas-microsoft-com:office:word" xmlns:w="http://schemas.openxmlformats.org/wordprocessingml/2006/main" xmlns:w14="http://schemas.microsoft.com/office/word/2010/wordml" xmlns:w15="http://schemas.microsoft.com/office/word/2012/wordml" xmlns:w16cex="http://schemas.microsoft.com/office/word/2018/wordml/cex" xmlns:w16cid="http://schemas.microsoft.com/office/word/2016/wordml/cid" xmlns:w16="http://schemas.microsoft.com/office/word/2018/wordml" xmlns:w16du="http://schemas.microsoft.com/office/word/2023/wordml/word16du" xmlns:w16sdtdh="http://schemas.microsoft.com/office/word/2020/wordml/sdtdatahash" xmlns:w16sdtfl="http://schemas.microsoft.com/office/word/2024/wordml/sdtformatlock" xmlns:w16se="http://schemas.microsoft.com/office/word/2015/wordml/symex" xmlns:wpg="http://schemas.microsoft.com/office/word/2010/wordprocessingGroup" xmlns:wpi="http://schemas.microsoft.com/office/word/2010/wordprocessingInk" xmlns:wne="http://schemas.microsoft.com/office/word/2006/wordml" xmlns:wps="http://schemas.microsoft.com/office/word/2010/wordprocessingShape" mc:Ignorable="w14 w15 w16se w16cid w16 w16cex w16sdtdh w16sdtfl w16du wp14">
+  <w:p>
+    <w:pPr>
+      <w:pStyle w:val="Header"/>
+    </w:pPr>
+  </w:p>
+</w:hdr>
 </file>
 
 <file path=word/numbering.xml><?xml version="1.0" encoding="utf-8"?>
@@ -1453,6 +1663,119 @@
       <w:pPr>
         <w:ind w:left="6480" w:hanging="180"/>
       </w:pPr>
+    </w:lvl>
+  </w:abstractNum>
+  <w:abstractNum w:abstractNumId="4" w15:restartNumberingAfterBreak="0">
+    <w:nsid w:val="49F161F0"/>
+    <w:multiLevelType w:val="hybridMultilevel"/>
+    <w:tmpl w:val="ED126BFE"/>
+    <w:lvl w:ilvl="0" w:tplc="0C090001">
+      <w:start w:val="1"/>
+      <w:numFmt w:val="bullet"/>
+      <w:lvlText w:val=""/>
+      <w:lvlJc w:val="left"/>
+      <w:pPr>
+        <w:ind w:left="720" w:hanging="360"/>
+      </w:pPr>
+      <w:rPr>
+        <w:rFonts w:ascii="Symbol" w:hAnsi="Symbol" w:hint="default"/>
+      </w:rPr>
+    </w:lvl>
+    <w:lvl w:ilvl="1" w:tplc="0C090003" w:tentative="1">
+      <w:start w:val="1"/>
+      <w:numFmt w:val="bullet"/>
+      <w:lvlText w:val="o"/>
+      <w:lvlJc w:val="left"/>
+      <w:pPr>
+        <w:ind w:left="1440" w:hanging="360"/>
+      </w:pPr>
+      <w:rPr>
+        <w:rFonts w:ascii="Courier New" w:hAnsi="Courier New" w:cs="Courier New" w:hint="default"/>
+      </w:rPr>
+    </w:lvl>
+    <w:lvl w:ilvl="2" w:tplc="0C090005" w:tentative="1">
+      <w:start w:val="1"/>
+      <w:numFmt w:val="bullet"/>
+      <w:lvlText w:val=""/>
+      <w:lvlJc w:val="left"/>
+      <w:pPr>
+        <w:ind w:left="2160" w:hanging="360"/>
+      </w:pPr>
+      <w:rPr>
+        <w:rFonts w:ascii="Wingdings" w:hAnsi="Wingdings" w:hint="default"/>
+      </w:rPr>
+    </w:lvl>
+    <w:lvl w:ilvl="3" w:tplc="0C090001" w:tentative="1">
+      <w:start w:val="1"/>
+      <w:numFmt w:val="bullet"/>
+      <w:lvlText w:val=""/>
+      <w:lvlJc w:val="left"/>
+      <w:pPr>
+        <w:ind w:left="2880" w:hanging="360"/>
+      </w:pPr>
+      <w:rPr>
+        <w:rFonts w:ascii="Symbol" w:hAnsi="Symbol" w:hint="default"/>
+      </w:rPr>
+    </w:lvl>
+    <w:lvl w:ilvl="4" w:tplc="0C090003" w:tentative="1">
+      <w:start w:val="1"/>
+      <w:numFmt w:val="bullet"/>
+      <w:lvlText w:val="o"/>
+      <w:lvlJc w:val="left"/>
+      <w:pPr>
+        <w:ind w:left="3600" w:hanging="360"/>
+      </w:pPr>
+      <w:rPr>
+        <w:rFonts w:ascii="Courier New" w:hAnsi="Courier New" w:cs="Courier New" w:hint="default"/>
+      </w:rPr>
+    </w:lvl>
+    <w:lvl w:ilvl="5" w:tplc="0C090005" w:tentative="1">
+      <w:start w:val="1"/>
+      <w:numFmt w:val="bullet"/>
+      <w:lvlText w:val=""/>
+      <w:lvlJc w:val="left"/>
+      <w:pPr>
+        <w:ind w:left="4320" w:hanging="360"/>
+      </w:pPr>
+      <w:rPr>
+        <w:rFonts w:ascii="Wingdings" w:hAnsi="Wingdings" w:hint="default"/>
+      </w:rPr>
+    </w:lvl>
+    <w:lvl w:ilvl="6" w:tplc="0C090001" w:tentative="1">
+      <w:start w:val="1"/>
+      <w:numFmt w:val="bullet"/>
+      <w:lvlText w:val=""/>
+      <w:lvlJc w:val="left"/>
+      <w:pPr>
+        <w:ind w:left="5040" w:hanging="360"/>
+      </w:pPr>
+      <w:rPr>
+        <w:rFonts w:ascii="Symbol" w:hAnsi="Symbol" w:hint="default"/>
+      </w:rPr>
+    </w:lvl>
+    <w:lvl w:ilvl="7" w:tplc="0C090003" w:tentative="1">
+      <w:start w:val="1"/>
+      <w:numFmt w:val="bullet"/>
+      <w:lvlText w:val="o"/>
+      <w:lvlJc w:val="left"/>
+      <w:pPr>
+        <w:ind w:left="5760" w:hanging="360"/>
+      </w:pPr>
+      <w:rPr>
+        <w:rFonts w:ascii="Courier New" w:hAnsi="Courier New" w:cs="Courier New" w:hint="default"/>
+      </w:rPr>
+    </w:lvl>
+    <w:lvl w:ilvl="8" w:tplc="0C090005" w:tentative="1">
+      <w:start w:val="1"/>
+      <w:numFmt w:val="bullet"/>
+      <w:lvlText w:val=""/>
+      <w:lvlJc w:val="left"/>
+      <w:pPr>
+        <w:ind w:left="6480" w:hanging="360"/>
+      </w:pPr>
+      <w:rPr>
+        <w:rFonts w:ascii="Wingdings" w:hAnsi="Wingdings" w:hint="default"/>
+      </w:rPr>
     </w:lvl>
   </w:abstractNum>
   <w:num w:numId="1" w16cid:durableId="304899270">
@@ -1503,6 +1826,9 @@
   <w:num w:numId="16" w16cid:durableId="259997620">
     <w:abstractNumId w:val="2"/>
   </w:num>
+  <w:num w:numId="17" w16cid:durableId="1233854851">
+    <w:abstractNumId w:val="4"/>
+  </w:num>
 </w:numbering>
 </file>
 
@@ -1527,6 +1853,7 @@
     <w:lsdException w:name="toc 1" w:uiPriority="39"/>
     <w:lsdException w:name="toc 2" w:uiPriority="39"/>
     <w:lsdException w:name="toc 3" w:uiPriority="39"/>
+    <w:lsdException w:name="header" w:uiPriority="99"/>
     <w:lsdException w:name="Hyperlink" w:uiPriority="99"/>
     <w:lsdException w:name="Normal Table" w:semiHidden="1" w:unhideWhenUsed="1"/>
     <w:lsdException w:name="Table Simple 1" w:semiHidden="1" w:unhideWhenUsed="1"/>
@@ -1774,6 +2101,9 @@
   <w:style w:type="paragraph" w:default="1" w:styleId="Normal">
     <w:name w:val="Normal"/>
     <w:qFormat/>
+    <w:rPr>
+      <w:lang w:val="en-AU"/>
+    </w:rPr>
   </w:style>
   <w:style w:type="paragraph" w:styleId="Heading1">
     <w:name w:val="heading 1"/>
@@ -1957,7 +2287,6 @@
   <w:style w:type="character" w:default="1" w:styleId="DefaultParagraphFont">
     <w:name w:val="Default Paragraph Font"/>
     <w:uiPriority w:val="1"/>
-    <w:semiHidden/>
     <w:unhideWhenUsed/>
   </w:style>
   <w:style w:type="table" w:default="1" w:styleId="TableNormal">
@@ -2585,6 +2914,46 @@
       <w:spacing w:after="100"/>
       <w:ind w:left="480"/>
     </w:pPr>
+  </w:style>
+  <w:style w:type="paragraph" w:styleId="Header">
+    <w:name w:val="header"/>
+    <w:basedOn w:val="Normal"/>
+    <w:link w:val="HeaderChar"/>
+    <w:uiPriority w:val="99"/>
+    <w:rsid w:val="00A94AFD"/>
+    <w:pPr>
+      <w:tabs>
+        <w:tab w:val="center" w:pos="4513"/>
+        <w:tab w:val="right" w:pos="9026"/>
+      </w:tabs>
+      <w:spacing w:after="0"/>
+    </w:pPr>
+  </w:style>
+  <w:style w:type="character" w:customStyle="1" w:styleId="HeaderChar">
+    <w:name w:val="Header Char"/>
+    <w:basedOn w:val="DefaultParagraphFont"/>
+    <w:link w:val="Header"/>
+    <w:uiPriority w:val="99"/>
+    <w:rsid w:val="00A94AFD"/>
+  </w:style>
+  <w:style w:type="paragraph" w:styleId="Footer">
+    <w:name w:val="footer"/>
+    <w:basedOn w:val="Normal"/>
+    <w:link w:val="FooterChar"/>
+    <w:rsid w:val="00A94AFD"/>
+    <w:pPr>
+      <w:tabs>
+        <w:tab w:val="center" w:pos="4513"/>
+        <w:tab w:val="right" w:pos="9026"/>
+      </w:tabs>
+      <w:spacing w:after="0"/>
+    </w:pPr>
+  </w:style>
+  <w:style w:type="character" w:customStyle="1" w:styleId="FooterChar">
+    <w:name w:val="Footer Char"/>
+    <w:basedOn w:val="DefaultParagraphFont"/>
+    <w:link w:val="Footer"/>
+    <w:rsid w:val="00A94AFD"/>
   </w:style>
 </w:styles>
 </file>

</xml_diff>